<commit_message>
Remove static Apps and Estate authority
</commit_message>
<xml_diff>
--- a/JOM Living Guide/JOM_Build_and_Deploy_Handbook_v1 1 1 1.docx
+++ b/JOM Living Guide/JOM_Build_and_Deploy_Handbook_v1 1 1 1.docx
@@ -4575,6 +4575,50 @@
         <ns0:t>The milestone runtime boundary retains admin_truth_v2.json, users_access_actionable_drilldown_v1.json, verified_active_jira_users_v1.json and organisation_inactive_display_identity_v1.json.</ns0:t>
       </ns0:r>
     </ns0:p>
+    <ns0:p>
+      <ns0:pPr>
+        <ns0:pStyle ns0:val="Heading1"/>
+      </ns0:pPr>
+      <ns0:r>
+        <ns0:t>30 September 2026 - Apps and Estate Runtime-Authority Repair</ns0:t>
+      </ns0:r>
+    </ns0:p>
+    <ns0:p>
+      <ns0:pPr>
+        <ns0:pStyle ns0:val="Heading2"/>
+      </ns0:pPr>
+      <ns0:r>
+        <ns0:t>Accepted authority correction</ns0:t>
+      </ns0:r>
+    </ns0:p>
+    <ns0:p>
+      <ns0:r>
+        <ns0:t>Hard-coded site allow-lists were removed from Site Review, Command Centre and Estate workspace paths. Site lifecycle and monitoring now follow runtime record semantics.</ns0:t>
+      </ns0:r>
+    </ns0:p>
+    <ns0:p>
+      <ns0:r>
+        <ns0:t>Site Review no longer infers admin ownership from site names or named-access evidence. Verified Admin Contacts site mapping supplies a generic admin route without exposing personal contact fields.</ns0:t>
+      </ns0:r>
+    </ns0:p>
+    <ns0:p>
+      <ns0:pPr>
+        <ns0:pStyle ns0:val="Heading2"/>
+      </ns0:pPr>
+      <ns0:r>
+        <ns0:t>Preserved boundaries</ns0:t>
+      </ns0:r>
+    </ns0:p>
+    <ns0:p>
+      <ns0:r>
+        <ns0:t>Estate remains site-lifecycle oriented. Complete Atlassian application inventory remains unavailable, and Shadow IT remains evidence-only with no approved integration.</ns0:t>
+      </ns0:r>
+    </ns0:p>
+    <ns0:p>
+      <ns0:r>
+        <ns0:t>Runtime reconciliation observed six sites, four monitored and two discovered. These are current runtime values, not fixed validator constants.</ns0:t>
+      </ns0:r>
+    </ns0:p>
     <ns0:sectPr ns0:rsidR="00FC693F" ns0:rsidRPr="0006063C" ns0:rsidSect="00034616">
       <ns0:headerReference ns0:type="default" ns2:id="rId9"/>
       <ns0:footerReference ns0:type="default" ns2:id="rId10"/>

</xml_diff>

<commit_message>
Simplify operator navigation and retain current runtime authority
</commit_message>
<xml_diff>
--- a/JOM Living Guide/JOM_Build_and_Deploy_Handbook_v1 1 1 1.docx
+++ b/JOM Living Guide/JOM_Build_and_Deploy_Handbook_v1 1 1 1.docx
@@ -4619,6 +4619,58 @@
         <ns0:t>Runtime reconciliation observed six sites, four monitored and two discovered. These are current runtime values, not fixed validator constants.</ns0:t>
       </ns0:r>
     </ns0:p>
+    <ns0:p>
+      <ns0:pPr>
+        <ns0:pStyle ns0:val="Heading1"/>
+      </ns0:pPr>
+      <ns0:r>
+        <ns0:t>1 October 2026 - Operator Navigation Milestone and Retained Canonical Runtime Generation</ns0:t>
+      </ns0:r>
+    </ns0:p>
+    <ns0:p>
+      <ns0:pPr>
+        <ns0:pStyle ns0:val="Heading2"/>
+      </ns0:pPr>
+      <ns0:r>
+        <ns0:t>Accepted navigation</ns0:t>
+      </ns0:r>
+    </ns0:p>
+    <ns0:p>
+      <ns0:r>
+        <ns0:t>JOM now exposes ten operator-oriented primary destinations while preserving specialist routes underneath. Policy &amp; Compliance remains available by route but is not primary navigation.</ns0:t>
+      </ns0:r>
+    </ns0:p>
+    <ns0:p>
+      <ns0:r>
+        <ns0:t>The navigation feature changes templates/_nav.html only. Brand, footer, mobile shell controls, backend routes, page owners, JavaScript, CSS and runtime authority remain separately owned.</ns0:t>
+      </ns0:r>
+    </ns0:p>
+    <ns0:p>
+      <ns0:pPr>
+        <ns0:pStyle ns0:val="Heading2"/>
+      </ns0:pPr>
+      <ns0:r>
+        <ns0:t>Runtime truth boundary</ns0:t>
+      </ns0:r>
+    </ns0:p>
+    <ns0:p>
+      <ns0:r>
+        <ns0:t>Successful canonical execution jom-refresh-9085c43c61d14c23bc5ce55c4d7ad131 produced genuine current authority and Source Health changes. The coherent generation is retained; only two transient access-audit JSONL changes were restored.</ns0:t>
+      </ns0:r>
+    </ns0:p>
+    <ns0:p>
+      <ns0:pPr>
+        <ns0:pStyle ns0:val="Heading2"/>
+      </ns0:pPr>
+      <ns0:r>
+        <ns0:t>Continuation</ns0:t>
+      </ns0:r>
+    </ns0:p>
+    <ns0:p>
+      <ns0:r>
+        <ns0:t>After exact Git closeout, Source Health becomes the first drawer-led UX consolidation pilot. Existing routes remain preserved during migration.</ns0:t>
+      </ns0:r>
+    </ns0:p>
     <ns0:sectPr ns0:rsidR="00FC693F" ns0:rsidRPr="0006063C" ns0:rsidSect="00034616">
       <ns0:headerReference ns0:type="default" ns2:id="rId9"/>
       <ns0:footerReference ns0:type="default" ns2:id="rId10"/>

</xml_diff>